<commit_message>
Updates - filler and csv testing
</commit_message>
<xml_diff>
--- a/README.docx
+++ b/README.docx
@@ -14,7 +14,6 @@
         <w:t xml:space="preserve">This </w:t>
       </w:r>
       <w:hyperlink r:id="rId4">
-        <w:proofErr w:type="spellStart"/>
         <w:r>
           <w:rPr>
             <w:color w:val="1155CC"/>
@@ -22,18 +21,9 @@
           </w:rPr>
           <w:t>github</w:t>
         </w:r>
-        <w:proofErr w:type="spellEnd"/>
       </w:hyperlink>
       <w:r>
-        <w:t xml:space="preserve"> provides a combination of processing for delay-mode data for both CHLA and DOXY in R software. Processing for BGC-Argo variables (oxygen, chlorophyll, </w:t>
-      </w:r>
-      <w:proofErr w:type="spellStart"/>
-      <w:r>
-        <w:t>bbp</w:t>
-      </w:r>
-      <w:proofErr w:type="spellEnd"/>
-      <w:r>
-        <w:t xml:space="preserve">, pH, nitrate) into delayed mode is currently done across three software programs, R, python, and MATLAB. </w:t>
+        <w:t xml:space="preserve"> provides a combination of processing for delay-mode data for both CHLA and DOXY in R software. Processing for BGC-Argo variables (oxygen, chlorophyll, bbp, pH, nitrate) into delayed mode is currently done across three software programs, R, python, and MATLAB. </w:t>
       </w:r>
     </w:p>
     <w:p/>
@@ -45,37 +35,13 @@
         <w:t xml:space="preserve">and BBP </w:t>
       </w:r>
       <w:r>
-        <w:t xml:space="preserve">code evolved through a collaboration with PMEL and AOML between Marin </w:t>
-      </w:r>
-      <w:proofErr w:type="spellStart"/>
-      <w:r>
-        <w:t>Cornec</w:t>
-      </w:r>
-      <w:proofErr w:type="spellEnd"/>
-      <w:r>
-        <w:t xml:space="preserve"> and Jen McWhorter. </w:t>
+        <w:t xml:space="preserve">code evolved through a collaboration with PMEL and AOML between Marin Cornec and Jen McWhorter. </w:t>
       </w:r>
     </w:p>
     <w:p/>
     <w:p>
       <w:r>
-        <w:t xml:space="preserve">DOXY in-air corrections were used from the </w:t>
-      </w:r>
-      <w:proofErr w:type="spellStart"/>
-      <w:r>
-        <w:t>Bittig</w:t>
-      </w:r>
-      <w:proofErr w:type="spellEnd"/>
-      <w:r>
-        <w:t xml:space="preserve"> outputs. </w:t>
-      </w:r>
-      <w:proofErr w:type="spellStart"/>
-      <w:r>
-        <w:t>BinFlag</w:t>
-      </w:r>
-      <w:proofErr w:type="spellEnd"/>
-      <w:r>
-        <w:t xml:space="preserve"> 5 applies in situ drift, carry over, and oxygen gain. The outputs and analysis for in-air oxygen corrections for each float can be found </w:t>
+        <w:t xml:space="preserve">DOXY in-air corrections were used from the Bittig outputs. BinFlag 5 applies in situ drift, carry over, and oxygen gain. The outputs and analysis for in-air oxygen corrections for each float can be found </w:t>
       </w:r>
       <w:hyperlink r:id="rId5">
         <w:r>
@@ -129,15 +95,7 @@
         </w:r>
       </w:hyperlink>
       <w:r>
-        <w:t xml:space="preserve">. Chris’s output produced 1.035 and SageO2 produced 1.037 for the gain value with a drift of 0.0011. SageO2 required updating code to work around the MATLAB </w:t>
-      </w:r>
-      <w:proofErr w:type="spellStart"/>
-      <w:r>
-        <w:t>nc</w:t>
-      </w:r>
-      <w:proofErr w:type="spellEnd"/>
-      <w:r>
-        <w:t xml:space="preserve"> toolbox from UCAR. </w:t>
+        <w:t xml:space="preserve">. Chris’s output produced 1.035 and SageO2 produced 1.037 for the gain value with a drift of 0.0011. SageO2 required updating code to work around the MATLAB nc toolbox from UCAR. </w:t>
       </w:r>
     </w:p>
     <w:p/>
@@ -167,6 +125,9 @@
       <w:r>
         <w:t>4903624 - broken bio-optical sensor</w:t>
       </w:r>
+      <w:r>
+        <w:t>, cycle 4 has one point that presents an error, manual change was made to fill values</w:t>
+      </w:r>
     </w:p>
     <w:p>
       <w:pPr>
@@ -231,31 +192,25 @@
         <w:spacing w:line="331" w:lineRule="auto"/>
       </w:pPr>
       <w:r>
-        <w:t xml:space="preserve">BD filler scripts were originally created by Hartmut </w:t>
-      </w:r>
-      <w:proofErr w:type="spellStart"/>
-      <w:r>
-        <w:t>Frenzel</w:t>
-      </w:r>
-      <w:proofErr w:type="spellEnd"/>
-      <w:r>
-        <w:t xml:space="preserve">, changes were made by Madi </w:t>
-      </w:r>
-      <w:proofErr w:type="spellStart"/>
-      <w:r>
-        <w:t>Soden</w:t>
-      </w:r>
-      <w:proofErr w:type="spellEnd"/>
-      <w:r>
-        <w:t xml:space="preserve">, and now updates have been made by Brandon Navarro, Jodi Brewster, and Jen McWhorter. BD filler script for CHLA works well. BD filler script for DOXY is having some issues. Conceptually we would like to submit CHLA and DOXY together (in BD files) to the GDAC to obtain an </w:t>
-      </w:r>
-      <w:proofErr w:type="spellStart"/>
-      <w:r>
-        <w:t>sProf</w:t>
-      </w:r>
-      <w:proofErr w:type="spellEnd"/>
-      <w:r>
-        <w:t xml:space="preserve"> that can be used in Sage (MATLAB software) to perform nitrate and pH DMQC. </w:t>
+        <w:t xml:space="preserve">BD filler scripts were originally created by Hartmut Frenzel, changes were made by Madi Soden, and now updates have been made by Brandon Navarro, Jodi Brewster, and Jen McWhorter. BD filler script for CHLA works well. BD filler script for DOXY is having some issues. Conceptually we would like to submit CHLA and DOXY together (in BD files) to the GDAC to obtain an sProf that can be used in Sage (MATLAB software) to perform nitrate and pH DMQC. </w:t>
+      </w:r>
+    </w:p>
+    <w:p>
+      <w:pPr>
+        <w:spacing w:line="331" w:lineRule="auto"/>
+      </w:pPr>
+    </w:p>
+    <w:p>
+      <w:pPr>
+        <w:spacing w:line="331" w:lineRule="auto"/>
+      </w:pPr>
+    </w:p>
+    <w:p>
+      <w:pPr>
+        <w:spacing w:line="331" w:lineRule="auto"/>
+      </w:pPr>
+      <w:r>
+        <w:t xml:space="preserve">***Jen check when CHLA fill values exist that CHLA_NOLUT has fill values too </w:t>
       </w:r>
     </w:p>
     <w:sectPr>
@@ -784,6 +739,7 @@
   <w:style w:type="character" w:default="1" w:styleId="DefaultParagraphFont">
     <w:name w:val="Default Paragraph Font"/>
     <w:uiPriority w:val="1"/>
+    <w:semiHidden/>
     <w:unhideWhenUsed/>
   </w:style>
   <w:style w:type="table" w:default="1" w:styleId="TableNormal">

</xml_diff>

<commit_message>
Updates to read me
</commit_message>
<xml_diff>
--- a/README.docx
+++ b/README.docx
@@ -14,6 +14,7 @@
         <w:t xml:space="preserve">This </w:t>
       </w:r>
       <w:hyperlink r:id="rId4">
+        <w:proofErr w:type="spellStart"/>
         <w:r>
           <w:rPr>
             <w:color w:val="1155CC"/>
@@ -21,9 +22,18 @@
           </w:rPr>
           <w:t>github</w:t>
         </w:r>
+        <w:proofErr w:type="spellEnd"/>
       </w:hyperlink>
       <w:r>
-        <w:t xml:space="preserve"> provides a combination of processing for delay-mode data for both CHLA and DOXY in R software. Processing for BGC-Argo variables (oxygen, chlorophyll, bbp, pH, nitrate) into delayed mode is currently done across three software programs, R, python, and MATLAB. </w:t>
+        <w:t xml:space="preserve"> provides a combination of processing for delay-mode data for both CHLA and DOXY in R software. Processing for BGC-Argo variables (oxygen, chlorophyll, </w:t>
+      </w:r>
+      <w:proofErr w:type="spellStart"/>
+      <w:r>
+        <w:t>bbp</w:t>
+      </w:r>
+      <w:proofErr w:type="spellEnd"/>
+      <w:r>
+        <w:t xml:space="preserve">, pH, nitrate) into delayed mode is currently done across three software programs, R, python, and MATLAB. </w:t>
       </w:r>
     </w:p>
     <w:p/>
@@ -35,13 +45,37 @@
         <w:t xml:space="preserve">and BBP </w:t>
       </w:r>
       <w:r>
-        <w:t xml:space="preserve">code evolved through a collaboration with PMEL and AOML between Marin Cornec and Jen McWhorter. </w:t>
+        <w:t xml:space="preserve">code evolved through a collaboration with PMEL and AOML between Marin </w:t>
+      </w:r>
+      <w:proofErr w:type="spellStart"/>
+      <w:r>
+        <w:t>Cornec</w:t>
+      </w:r>
+      <w:proofErr w:type="spellEnd"/>
+      <w:r>
+        <w:t xml:space="preserve"> and Jen McWhorter. </w:t>
       </w:r>
     </w:p>
     <w:p/>
     <w:p>
       <w:r>
-        <w:t xml:space="preserve">DOXY in-air corrections were used from the Bittig outputs. BinFlag 5 applies in situ drift, carry over, and oxygen gain. The outputs and analysis for in-air oxygen corrections for each float can be found </w:t>
+        <w:t xml:space="preserve">DOXY in-air corrections were used from the </w:t>
+      </w:r>
+      <w:proofErr w:type="spellStart"/>
+      <w:r>
+        <w:t>Bittig</w:t>
+      </w:r>
+      <w:proofErr w:type="spellEnd"/>
+      <w:r>
+        <w:t xml:space="preserve"> outputs. </w:t>
+      </w:r>
+      <w:proofErr w:type="spellStart"/>
+      <w:r>
+        <w:t>BinFlag</w:t>
+      </w:r>
+      <w:proofErr w:type="spellEnd"/>
+      <w:r>
+        <w:t xml:space="preserve"> 5 applies in situ drift, carry over, and oxygen gain. The outputs and analysis for in-air oxygen corrections for each float can be found </w:t>
       </w:r>
       <w:hyperlink r:id="rId5">
         <w:r>
@@ -95,7 +129,15 @@
         </w:r>
       </w:hyperlink>
       <w:r>
-        <w:t xml:space="preserve">. Chris’s output produced 1.035 and SageO2 produced 1.037 for the gain value with a drift of 0.0011. SageO2 required updating code to work around the MATLAB nc toolbox from UCAR. </w:t>
+        <w:t xml:space="preserve">. Chris’s output produced 1.035 and SageO2 produced 1.037 for the gain value with a drift of 0.0011. SageO2 required updating code to work around the MATLAB </w:t>
+      </w:r>
+      <w:proofErr w:type="spellStart"/>
+      <w:r>
+        <w:t>nc</w:t>
+      </w:r>
+      <w:proofErr w:type="spellEnd"/>
+      <w:r>
+        <w:t xml:space="preserve"> toolbox from UCAR. </w:t>
       </w:r>
     </w:p>
     <w:p/>
@@ -126,7 +168,7 @@
         <w:t>4903624 - broken bio-optical sensor</w:t>
       </w:r>
       <w:r>
-        <w:t>, cycle 4 has one point that presents an error, manual change was made to fill values</w:t>
+        <w:t xml:space="preserve"> from the beginning, hard coded to fill values for CHLA and BBP </w:t>
       </w:r>
     </w:p>
     <w:p>
@@ -150,15 +192,36 @@
         <w:spacing w:line="331" w:lineRule="auto"/>
       </w:pPr>
       <w:r>
-        <w:t>2904010 - shallower profiles initial cycles, failed bio-optical sensor later on</w:t>
-      </w:r>
-    </w:p>
-    <w:p>
-      <w:pPr>
-        <w:spacing w:line="331" w:lineRule="auto"/>
-      </w:pPr>
-      <w:r>
-        <w:t>2904011 - shallower profiles initial cycles, failed bio-optical sensor later on</w:t>
+        <w:t xml:space="preserve">2904010 - shallower profiles initial cycles, failed </w:t>
+      </w:r>
+      <w:r>
+        <w:t xml:space="preserve">CHLA and BBP cycle </w:t>
+      </w:r>
+      <w:r>
+        <w:t>49</w:t>
+      </w:r>
+      <w:r>
+        <w:t xml:space="preserve"> onwards</w:t>
+      </w:r>
+      <w:r>
+        <w:t>, hard coded to fill values</w:t>
+      </w:r>
+      <w:r>
+        <w:t xml:space="preserve"> </w:t>
+      </w:r>
+    </w:p>
+    <w:p>
+      <w:pPr>
+        <w:spacing w:line="331" w:lineRule="auto"/>
+      </w:pPr>
+      <w:r>
+        <w:t xml:space="preserve">2904011 - shallower profiles initial cycles, failed </w:t>
+      </w:r>
+      <w:r>
+        <w:t>CHLA and BBP cycle 24 onwards</w:t>
+      </w:r>
+      <w:r>
+        <w:t>, hard coded to fill values</w:t>
       </w:r>
     </w:p>
     <w:p>
@@ -192,7 +255,31 @@
         <w:spacing w:line="331" w:lineRule="auto"/>
       </w:pPr>
       <w:r>
-        <w:t xml:space="preserve">BD filler scripts were originally created by Hartmut Frenzel, changes were made by Madi Soden, and now updates have been made by Brandon Navarro, Jodi Brewster, and Jen McWhorter. BD filler script for CHLA works well. BD filler script for DOXY is having some issues. Conceptually we would like to submit CHLA and DOXY together (in BD files) to the GDAC to obtain an sProf that can be used in Sage (MATLAB software) to perform nitrate and pH DMQC. </w:t>
+        <w:t xml:space="preserve">BD filler scripts were originally created by Hartmut </w:t>
+      </w:r>
+      <w:proofErr w:type="spellStart"/>
+      <w:r>
+        <w:t>Frenzel</w:t>
+      </w:r>
+      <w:proofErr w:type="spellEnd"/>
+      <w:r>
+        <w:t xml:space="preserve">, changes were made by Madi </w:t>
+      </w:r>
+      <w:proofErr w:type="spellStart"/>
+      <w:r>
+        <w:t>Soden</w:t>
+      </w:r>
+      <w:proofErr w:type="spellEnd"/>
+      <w:r>
+        <w:t xml:space="preserve">, and now updates have been made by Brandon Navarro, Jodi Brewster, and Jen McWhorter. BD filler script for CHLA works well. BD filler script for DOXY is having some issues. Conceptually we would like to submit CHLA and DOXY together (in BD files) to the GDAC to obtain an </w:t>
+      </w:r>
+      <w:proofErr w:type="spellStart"/>
+      <w:r>
+        <w:t>sProf</w:t>
+      </w:r>
+      <w:proofErr w:type="spellEnd"/>
+      <w:r>
+        <w:t xml:space="preserve"> that can be used in Sage (MATLAB software) to perform nitrate and pH DMQC. </w:t>
       </w:r>
     </w:p>
     <w:p>

</xml_diff>